<commit_message>
upload 10_stage2_inputs_841b49be0c01 shared/subtitle.srt to segments/S015.mp4
</commit_message>
<xml_diff>
--- a/10_stage2_inputs_841b49be0c01/shared/note.docx
+++ b/10_stage2_inputs_841b49be0c01/shared/note.docx
@@ -7,7 +7,7 @@
         <w:pStyle w:val="Title"/>
       </w:pPr>
       <w:r>
-        <w:t>第九课：三相电路典型题型</w:t>
+        <w:t>第九课 三相电路与新型负载题型</w:t>
       </w:r>
     </w:p>
     <w:p>
@@ -15,7 +15,7 @@
         <w:pStyle w:val="Heading1"/>
       </w:pPr>
       <w:r>
-        <w:t>一、三相电路四类典型题型</w:t>
+        <w:t>一、三相电路七个核心名词</w:t>
       </w:r>
     </w:p>
     <w:p>
@@ -23,7 +23,7 @@
         <w:pStyle w:val="Heading2"/>
       </w:pPr>
       <w:r>
-        <w:t>第一类：三相电路与星形负载</w:t>
+        <w:t>电源与线电压基础</w:t>
       </w:r>
     </w:p>
     <w:p>
@@ -31,7 +31,7 @@
         <w:pStyle w:val="Heading3"/>
       </w:pPr>
       <w:r>
-        <w:t>S001 第一类题型结构与七个核心量</w:t>
+        <w:t>S001 三相电路题型概述与七个核心名词</w:t>
       </w:r>
     </w:p>
     <w:p>
@@ -39,7 +39,7 @@
         <w:pStyle w:val="Heading3"/>
       </w:pPr>
       <w:r>
-        <w:t>S002 电源端电压的三相关系</w:t>
+        <w:t>S002 电源端电压的定义与相位关系</w:t>
       </w:r>
     </w:p>
     <w:p>
@@ -47,7 +47,15 @@
         <w:pStyle w:val="Heading3"/>
       </w:pPr>
       <w:r>
-        <w:t>S003 线电压与端电压的关系</w:t>
+        <w:t>S003 线电压定义及与端电压的换算关系</w:t>
+      </w:r>
+    </w:p>
+    <w:p>
+      <w:pPr>
+        <w:pStyle w:val="Heading2"/>
+      </w:pPr>
+      <w:r>
+        <w:t>电流相关概念</w:t>
       </w:r>
     </w:p>
     <w:p>
@@ -55,7 +63,7 @@
         <w:pStyle w:val="Heading3"/>
       </w:pPr>
       <w:r>
-        <w:t>S004 线电流的计算与三相关系</w:t>
+        <w:t>S004 线电流的定义与计算方法</w:t>
       </w:r>
     </w:p>
     <w:p>
@@ -71,7 +79,15 @@
         <w:pStyle w:val="Heading3"/>
       </w:pPr>
       <w:r>
-        <w:t>S006 星形负载的负载端线电流</w:t>
+        <w:t>S006 负载端线电流的定义与特点</w:t>
+      </w:r>
+    </w:p>
+    <w:p>
+      <w:pPr>
+        <w:pStyle w:val="Heading2"/>
+      </w:pPr>
+      <w:r>
+        <w:t>电压与功率计算</w:t>
       </w:r>
     </w:p>
     <w:p>
@@ -79,7 +95,7 @@
         <w:pStyle w:val="Heading3"/>
       </w:pPr>
       <w:r>
-        <w:t>S007 负载端相电压的计算</w:t>
+        <w:t>S007 负载端相电压的定义与计算</w:t>
       </w:r>
     </w:p>
     <w:p>
@@ -87,7 +103,23 @@
         <w:pStyle w:val="Heading3"/>
       </w:pPr>
       <w:r>
-        <w:t>S008 负载端线电压与七个核心量总结</w:t>
+        <w:t>S008 负载端线电压的定义与计算</w:t>
+      </w:r>
+    </w:p>
+    <w:p>
+      <w:pPr>
+        <w:pStyle w:val="Heading1"/>
+      </w:pPr>
+      <w:r>
+        <w:t>二、三相电路典型题型分析</w:t>
+      </w:r>
+    </w:p>
+    <w:p>
+      <w:pPr>
+        <w:pStyle w:val="Heading2"/>
+      </w:pPr>
+      <w:r>
+        <w:t>新型负载连接分析</w:t>
       </w:r>
     </w:p>
     <w:p>
@@ -95,7 +127,7 @@
         <w:pStyle w:val="Heading3"/>
       </w:pPr>
       <w:r>
-        <w:t>S009 星形负载题的两项补充规则</w:t>
+        <w:t>S009 第一类题型电路图分析方法</w:t>
       </w:r>
     </w:p>
     <w:p>
@@ -103,7 +135,15 @@
         <w:pStyle w:val="Heading3"/>
       </w:pPr>
       <w:r>
-        <w:t>S010 星形负载例题：求负载电流与线电压</w:t>
+        <w:t>S010 负载连接方式与等效分析</w:t>
+      </w:r>
+    </w:p>
+    <w:p>
+      <w:pPr>
+        <w:pStyle w:val="Heading2"/>
+      </w:pPr>
+      <w:r>
+        <w:t>三相电路计算实例</w:t>
       </w:r>
     </w:p>
     <w:p>
@@ -111,7 +151,23 @@
         <w:pStyle w:val="Heading3"/>
       </w:pPr>
       <w:r>
-        <w:t>S011 第一类题型的等价电路图识别</w:t>
+        <w:t>S011 三相电路参数计算综合过程</w:t>
+      </w:r>
+    </w:p>
+    <w:p>
+      <w:pPr>
+        <w:pStyle w:val="Heading3"/>
+      </w:pPr>
+      <w:r>
+        <w:t>S012 复杂负载电路的分析步骤</w:t>
+      </w:r>
+    </w:p>
+    <w:p>
+      <w:pPr>
+        <w:pStyle w:val="Heading1"/>
+      </w:pPr>
+      <w:r>
+        <w:t>三、功率相关知识</w:t>
       </w:r>
     </w:p>
     <w:p>
@@ -119,7 +175,7 @@
         <w:pStyle w:val="Heading2"/>
       </w:pPr>
       <w:r>
-        <w:t>第二类：三相电路与三角形负载</w:t>
+        <w:t>三相功率计算</w:t>
       </w:r>
     </w:p>
     <w:p>
@@ -127,7 +183,7 @@
         <w:pStyle w:val="Heading3"/>
       </w:pPr>
       <w:r>
-        <w:t>S012 三角形负载的端电压与线电压</w:t>
+        <w:t>S013 三相功率基本概念</w:t>
       </w:r>
     </w:p>
     <w:p>
@@ -135,7 +191,7 @@
         <w:pStyle w:val="Heading3"/>
       </w:pPr>
       <w:r>
-        <w:t>S013 三角形负载线电流的星形等效法</w:t>
+        <w:t>S014 有功功率、无功功率计算</w:t>
       </w:r>
     </w:p>
     <w:p>
@@ -143,95 +199,7 @@
         <w:pStyle w:val="Heading3"/>
       </w:pPr>
       <w:r>
-        <w:t>S014 三角形负载其余四个核心量及特殊情况</w:t>
-      </w:r>
-    </w:p>
-    <w:p>
-      <w:pPr>
-        <w:pStyle w:val="Heading3"/>
-      </w:pPr>
-      <w:r>
-        <w:t>S015 三角形负载例题：线电流与相电流</w:t>
-      </w:r>
-    </w:p>
-    <w:p>
-      <w:pPr>
-        <w:pStyle w:val="Heading3"/>
-      </w:pPr>
-      <w:r>
-        <w:t>S016 星形与三角形负载混合连接例题</w:t>
-      </w:r>
-    </w:p>
-    <w:p>
-      <w:pPr>
-        <w:pStyle w:val="Heading2"/>
-      </w:pPr>
-      <w:r>
-        <w:t>第三类：求三相电路功率表读数</w:t>
-      </w:r>
-    </w:p>
-    <w:p>
-      <w:pPr>
-        <w:pStyle w:val="Heading3"/>
-      </w:pPr>
-      <w:r>
-        <w:t>S017 功率表接线结构与读数公式</w:t>
-      </w:r>
-    </w:p>
-    <w:p>
-      <w:pPr>
-        <w:pStyle w:val="Heading3"/>
-      </w:pPr>
-      <w:r>
-        <w:t>S018 功率表公式中电流、电压与相角的判定</w:t>
-      </w:r>
-    </w:p>
-    <w:p>
-      <w:pPr>
-        <w:pStyle w:val="Heading3"/>
-      </w:pPr>
-      <w:r>
-        <w:t>S019 功率表读数例题</w:t>
-      </w:r>
-    </w:p>
-    <w:p>
-      <w:pPr>
-        <w:pStyle w:val="Heading2"/>
-      </w:pPr>
-      <w:r>
-        <w:t>第四类：双功率表读数已知求功率</w:t>
-      </w:r>
-    </w:p>
-    <w:p>
-      <w:pPr>
-        <w:pStyle w:val="Heading3"/>
-      </w:pPr>
-      <w:r>
-        <w:t>S020 双功率表法题型与第一步设量</w:t>
-      </w:r>
-    </w:p>
-    <w:p>
-      <w:pPr>
-        <w:pStyle w:val="Heading3"/>
-      </w:pPr>
-      <w:r>
-        <w:t>S021 第二步表示三相线电压与线电流</w:t>
-      </w:r>
-    </w:p>
-    <w:p>
-      <w:pPr>
-        <w:pStyle w:val="Heading3"/>
-      </w:pPr>
-      <w:r>
-        <w:t>S022 第三步由功率表读数求相角与正切值</w:t>
-      </w:r>
-    </w:p>
-    <w:p>
-      <w:pPr>
-        <w:pStyle w:val="Heading3"/>
-      </w:pPr>
-      <w:r>
-        <w:t>S023 第四步求有功、无功、视在与复功率</w:t>
+        <w:t>S015 复功率计算与综合例题完成</w:t>
       </w:r>
     </w:p>
     <w:sectPr>

</xml_diff>

<commit_message>
upload 10_stage2_inputs_841b49be0c01 shared/subtitle.srt to segments/S017.mp4
</commit_message>
<xml_diff>
--- a/10_stage2_inputs_841b49be0c01/shared/note.docx
+++ b/10_stage2_inputs_841b49be0c01/shared/note.docx
@@ -7,7 +7,7 @@
         <w:pStyle w:val="Title"/>
       </w:pPr>
       <w:r>
-        <w:t>第九课 三相电路与新型负载题型</w:t>
+        <w:t>第九课：三相电路典型题型</w:t>
       </w:r>
     </w:p>
     <w:p>
@@ -15,7 +15,7 @@
         <w:pStyle w:val="Heading1"/>
       </w:pPr>
       <w:r>
-        <w:t>一、三相电路七个核心名词</w:t>
+        <w:t>一、三相电路与星形负载</w:t>
       </w:r>
     </w:p>
     <w:p>
@@ -23,7 +23,7 @@
         <w:pStyle w:val="Heading2"/>
       </w:pPr>
       <w:r>
-        <w:t>电源与线电压基础</w:t>
+        <w:t>七个核心量及求法</w:t>
       </w:r>
     </w:p>
     <w:p>
@@ -31,7 +31,7 @@
         <w:pStyle w:val="Heading3"/>
       </w:pPr>
       <w:r>
-        <w:t>S001 三相电路题型概述与七个核心名词</w:t>
+        <w:t>S001 题型概览与七个核心量</w:t>
       </w:r>
     </w:p>
     <w:p>
@@ -39,7 +39,7 @@
         <w:pStyle w:val="Heading3"/>
       </w:pPr>
       <w:r>
-        <w:t>S002 电源端电压的定义与相位关系</w:t>
+        <w:t>S002 电源端电压的相量关系</w:t>
       </w:r>
     </w:p>
     <w:p>
@@ -47,7 +47,47 @@
         <w:pStyle w:val="Heading3"/>
       </w:pPr>
       <w:r>
-        <w:t>S003 线电压定义及与端电压的换算关系</w:t>
+        <w:t>S003 线电压与端电压的关系</w:t>
+      </w:r>
+    </w:p>
+    <w:p>
+      <w:pPr>
+        <w:pStyle w:val="Heading3"/>
+      </w:pPr>
+      <w:r>
+        <w:t>S004 线电流的计算与相位关系</w:t>
+      </w:r>
+    </w:p>
+    <w:p>
+      <w:pPr>
+        <w:pStyle w:val="Heading3"/>
+      </w:pPr>
+      <w:r>
+        <w:t>S005 负载端相电流</w:t>
+      </w:r>
+    </w:p>
+    <w:p>
+      <w:pPr>
+        <w:pStyle w:val="Heading3"/>
+      </w:pPr>
+      <w:r>
+        <w:t>S006 星形负载的线电流与相电流关系</w:t>
+      </w:r>
+    </w:p>
+    <w:p>
+      <w:pPr>
+        <w:pStyle w:val="Heading3"/>
+      </w:pPr>
+      <w:r>
+        <w:t>S007 负载端相电压</w:t>
+      </w:r>
+    </w:p>
+    <w:p>
+      <w:pPr>
+        <w:pStyle w:val="Heading3"/>
+      </w:pPr>
+      <w:r>
+        <w:t>S008 负载端线电压</w:t>
       </w:r>
     </w:p>
     <w:p>
@@ -55,7 +95,7 @@
         <w:pStyle w:val="Heading2"/>
       </w:pPr>
       <w:r>
-        <w:t>电流相关概念</w:t>
+        <w:t>做题规则与例题</w:t>
       </w:r>
     </w:p>
     <w:p>
@@ -63,7 +103,7 @@
         <w:pStyle w:val="Heading3"/>
       </w:pPr>
       <w:r>
-        <w:t>S004 线电流的定义与计算方法</w:t>
+        <w:t>S009 七个核心量的做题注意事项</w:t>
       </w:r>
     </w:p>
     <w:p>
@@ -71,7 +111,23 @@
         <w:pStyle w:val="Heading3"/>
       </w:pPr>
       <w:r>
-        <w:t>S005 负载端相电流的定义与求法</w:t>
+        <w:t>S010 星形负载例题：由已知参数求各电气量</w:t>
+      </w:r>
+    </w:p>
+    <w:p>
+      <w:pPr>
+        <w:pStyle w:val="Heading1"/>
+      </w:pPr>
+      <w:r>
+        <w:t>二、三相电路与三角形负载</w:t>
+      </w:r>
+    </w:p>
+    <w:p>
+      <w:pPr>
+        <w:pStyle w:val="Heading2"/>
+      </w:pPr>
+      <w:r>
+        <w:t>七个核心量及三角形—星形等效</w:t>
       </w:r>
     </w:p>
     <w:p>
@@ -79,7 +135,63 @@
         <w:pStyle w:val="Heading3"/>
       </w:pPr>
       <w:r>
-        <w:t>S006 负载端线电流的定义与特点</w:t>
+        <w:t>S011 三角形负载题型概览</w:t>
+      </w:r>
+    </w:p>
+    <w:p>
+      <w:pPr>
+        <w:pStyle w:val="Heading3"/>
+      </w:pPr>
+      <w:r>
+        <w:t>S012 三角形负载的电源端电压</w:t>
+      </w:r>
+    </w:p>
+    <w:p>
+      <w:pPr>
+        <w:pStyle w:val="Heading3"/>
+      </w:pPr>
+      <w:r>
+        <w:t>S013 三角形负载的线电压</w:t>
+      </w:r>
+    </w:p>
+    <w:p>
+      <w:pPr>
+        <w:pStyle w:val="Heading3"/>
+      </w:pPr>
+      <w:r>
+        <w:t>S014 三角形负载线电流与等效变换</w:t>
+      </w:r>
+    </w:p>
+    <w:p>
+      <w:pPr>
+        <w:pStyle w:val="Heading3"/>
+      </w:pPr>
+      <w:r>
+        <w:t>S015 三角形负载的相电流</w:t>
+      </w:r>
+    </w:p>
+    <w:p>
+      <w:pPr>
+        <w:pStyle w:val="Heading3"/>
+      </w:pPr>
+      <w:r>
+        <w:t>S016 三角形负载的线电流与相电流关系</w:t>
+      </w:r>
+    </w:p>
+    <w:p>
+      <w:pPr>
+        <w:pStyle w:val="Heading3"/>
+      </w:pPr>
+      <w:r>
+        <w:t>S017 三角形负载的相电压</w:t>
+      </w:r>
+    </w:p>
+    <w:p>
+      <w:pPr>
+        <w:pStyle w:val="Heading3"/>
+      </w:pPr>
+      <w:r>
+        <w:t>S018 三角形负载的线电压与补充规则</w:t>
       </w:r>
     </w:p>
     <w:p>
@@ -87,7 +199,7 @@
         <w:pStyle w:val="Heading2"/>
       </w:pPr>
       <w:r>
-        <w:t>电压与功率计算</w:t>
+        <w:t>典型例题</w:t>
       </w:r>
     </w:p>
     <w:p>
@@ -95,7 +207,7 @@
         <w:pStyle w:val="Heading3"/>
       </w:pPr>
       <w:r>
-        <w:t>S007 负载端相电压的定义与计算</w:t>
+        <w:t>S019 三角形负载例题：求线电流与负载相电流</w:t>
       </w:r>
     </w:p>
     <w:p>
@@ -103,7 +215,7 @@
         <w:pStyle w:val="Heading3"/>
       </w:pPr>
       <w:r>
-        <w:t>S008 负载端线电压的定义与计算</w:t>
+        <w:t>S020 星形与三角形混合负载例题</w:t>
       </w:r>
     </w:p>
     <w:p>
@@ -111,7 +223,7 @@
         <w:pStyle w:val="Heading1"/>
       </w:pPr>
       <w:r>
-        <w:t>二、三相电路典型题型分析</w:t>
+        <w:t>三、三相电路功率表读数</w:t>
       </w:r>
     </w:p>
     <w:p>
@@ -119,7 +231,7 @@
         <w:pStyle w:val="Heading2"/>
       </w:pPr>
       <w:r>
-        <w:t>新型负载连接分析</w:t>
+        <w:t>功率表接线与读数公式</w:t>
       </w:r>
     </w:p>
     <w:p>
@@ -127,7 +239,15 @@
         <w:pStyle w:val="Heading3"/>
       </w:pPr>
       <w:r>
-        <w:t>S009 第一类题型电路图分析方法</w:t>
+        <w:t>S021 功率表接线识别与读数公式</w:t>
+      </w:r>
+    </w:p>
+    <w:p>
+      <w:pPr>
+        <w:pStyle w:val="Heading2"/>
+      </w:pPr>
+      <w:r>
+        <w:t>例题</w:t>
       </w:r>
     </w:p>
     <w:p>
@@ -135,7 +255,15 @@
         <w:pStyle w:val="Heading3"/>
       </w:pPr>
       <w:r>
-        <w:t>S010 负载连接方式与等效分析</w:t>
+        <w:t>S022 功率表读数例题：代入线电压与线电流</w:t>
+      </w:r>
+    </w:p>
+    <w:p>
+      <w:pPr>
+        <w:pStyle w:val="Heading1"/>
+      </w:pPr>
+      <w:r>
+        <w:t>四、两功率表法求三相功率</w:t>
       </w:r>
     </w:p>
     <w:p>
@@ -143,7 +271,7 @@
         <w:pStyle w:val="Heading2"/>
       </w:pPr>
       <w:r>
-        <w:t>三相电路计算实例</w:t>
+        <w:t>四步解题法</w:t>
       </w:r>
     </w:p>
     <w:p>
@@ -151,7 +279,7 @@
         <w:pStyle w:val="Heading3"/>
       </w:pPr>
       <w:r>
-        <w:t>S011 三相电路参数计算综合过程</w:t>
+        <w:t>S023 第一步：设电源端电压与线电流</w:t>
       </w:r>
     </w:p>
     <w:p>
@@ -159,23 +287,7 @@
         <w:pStyle w:val="Heading3"/>
       </w:pPr>
       <w:r>
-        <w:t>S012 复杂负载电路的分析步骤</w:t>
-      </w:r>
-    </w:p>
-    <w:p>
-      <w:pPr>
-        <w:pStyle w:val="Heading1"/>
-      </w:pPr>
-      <w:r>
-        <w:t>三、功率相关知识</w:t>
-      </w:r>
-    </w:p>
-    <w:p>
-      <w:pPr>
-        <w:pStyle w:val="Heading2"/>
-      </w:pPr>
-      <w:r>
-        <w:t>三相功率计算</w:t>
+        <w:t>S024 第二步：表示各线电压与线电流</w:t>
       </w:r>
     </w:p>
     <w:p>
@@ -183,7 +295,7 @@
         <w:pStyle w:val="Heading3"/>
       </w:pPr>
       <w:r>
-        <w:t>S013 三相功率基本概念</w:t>
+        <w:t>S025 第三步：由两只功率表求相位角</w:t>
       </w:r>
     </w:p>
     <w:p>
@@ -191,15 +303,7 @@
         <w:pStyle w:val="Heading3"/>
       </w:pPr>
       <w:r>
-        <w:t>S014 有功功率、无功功率计算</w:t>
-      </w:r>
-    </w:p>
-    <w:p>
-      <w:pPr>
-        <w:pStyle w:val="Heading3"/>
-      </w:pPr>
-      <w:r>
-        <w:t>S015 复功率计算与综合例题完成</w:t>
+        <w:t>S026 第四步：求有功、无功、视在与复功率</w:t>
       </w:r>
     </w:p>
     <w:sectPr>

</xml_diff>